<commit_message>
update: Cap nhat nhat ky hoc hoi va bai da nau oc vit
</commit_message>
<xml_diff>
--- a/outputs/da_nau_oc_vit_chiec_thuoc_ke.docx
+++ b/outputs/da_nau_oc_vit_chiec_thuoc_ke.docx
@@ -84,7 +84,7 @@
         <w:rPr>
           <w:color w:val="000000"/>
         </w:rPr>
-        <w:t xml:space="preserve">Năm 2022, giữa sa mạc nắng 45 độ C của Qatar, những người thợ Việt Nam hoàn thành việc lắp ráp mái vòm thép khổng lồ cho sân vận động Lusail — nơi sau đó Lionel Messi nâng cao chiếc cúp vàng World Cup trước hàng tỷ khán giả. Trở về phòng trọ sau ca làm, một người thợ mở điện thoại lướt mạng xã hội quê nhà, và dòng bình luận đầu tiên đập vào mắt anh là: </w:t>
+        <w:t xml:space="preserve">Năm 2022, giữa sa mạc nắng 45 độ ở Qatar, mấy anh thợ Việt Nam mồ hôi nhỏ giọt trên tấm thép nóng bỏng, cặm cụi hàn xong mái vòm khổng lồ cho sân vận động Lusail — cái sân mà sau đó Messi nâng cúp vàng World Cup trước mặt cả tỷ người. Tối hôm ấy, về phòng trọ, một anh thợ mở điện thoại lướt mạng xã hội quê nhà. Dòng bình luận đầu tiên đập vào mắt: </w:t>
       </w:r>
       <w:r>
         <w:rPr>
@@ -107,7 +107,7 @@
         <w:rPr>
           <w:color w:val="000000"/>
         </w:rPr>
-        <w:t>Có một bài kiểm tra kỳ lạ mà suốt hơn mười năm qua, chúng ta vẫn miệt mài đem ra để chấm điểm cho cả một nền kinh tế: không phải bằng những giàn khoan ngoài biển khơi, cũng chẳng phải bằng các cấu kiện tàu ngầm triệu đô, mà bằng một mảnh kim loại dài chưa đầy hai đốt ngón tay — con ốc vít.</w:t>
+        <w:t>Có một bài kiểm tra kỳ lạ mà suốt hơn mười năm qua, chúng ta cứ lôi ra chấm điểm cho cả một nền kinh tế. Không phải bằng giàn khoan ngoài biển khơi. Không phải bằng linh kiện tàu ngầm triệu đô. Mà bằng một mẩu kim loại bé hơn đốt ngón tay út — con ốc vít.</w:t>
       </w:r>
     </w:p>
     <w:p>
@@ -134,7 +134,7 @@
         <w:rPr>
           <w:color w:val="000000"/>
         </w:rPr>
-        <w:t xml:space="preserve">Tại sao một câu hỏi tưởng như rất nhỏ bé về chiếc ốc vít lại có thể trở thành một bản án treo dai dẳng, phủ nhận toàn bộ mồ hôi và năng lực của hàng vạn kỹ sư, thợ cơ khí Việt Nam trên khắp các công trình quốc tế? </w:t>
+        <w:t>Rốt cuộc thì con ốc vít ấy — cái thứ mà cả cân mua ngoài chợ giá bằng hai bát phở — nó có đáng để trở thành bản án treo lơ lửng suốt mười mấy năm, phủ bóng lên mồ hôi của hàng vạn người thợ Việt đang hàn, tiện, dập từng chi tiết máy cho cả thế giới dùng hay không?</w:t>
       </w:r>
     </w:p>
     <w:p>
@@ -142,7 +142,7 @@
         <w:rPr>
           <w:color w:val="000000"/>
         </w:rPr>
-        <w:t>Ngay sau đây, chúng ta cùng tìm hiểu các bạn nhé.</w:t>
+        <w:t>Vậy thực hư câu chuyện "ốc vít" này là thế nào?</w:t>
       </w:r>
     </w:p>
     <w:p>
@@ -177,7 +177,7 @@
         <w:rPr>
           <w:color w:val="000000"/>
         </w:rPr>
-        <w:t xml:space="preserve">Tôi luôn dành một sự ngưỡng mộ rất thật cho sự kiên định của cư dân mạng. </w:t>
+        <w:t>Tôi luôn dành một sự ngưỡng mộ rất thật cho sự kiên định của cư dân mạng.</w:t>
       </w:r>
     </w:p>
     <w:p>
@@ -185,7 +185,7 @@
         <w:rPr>
           <w:color w:val="000000"/>
         </w:rPr>
-        <w:t>Hơn mười năm qua, thế giới đã kịp chuyển mình từ mạng 3G lên 5G, xe điện đã chạy đầy đường, và trí tuệ nhân tạo thì đang bắt đầu dạy con người cách viết email xin việc. Thế nhưng, tiêu chuẩn để nhiều người trong chúng ta đo lường sự trưởng thành của nền công nghiệp nước nhà thì dường như vẫn được bảo quản nguyên vẹn trong tủ kính: một con ốc vít.</w:t>
+        <w:t>Mười mấy năm trôi qua, thế giới kịp chạy từ 3G lên 5G, xe điện chạy đầy phố, trí tuệ nhân tạo thì bắt đầu viết hộ cả thư xin việc. Vậy mà cái thước mà nhiều người trong chúng ta dùng để chấm điểm nền công nghiệp nước nhà thì vẫn y nguyên, cất kỹ trong tủ kính từ đời nào: một con ốc vít.</w:t>
       </w:r>
     </w:p>
     <w:p>
@@ -193,7 +193,7 @@
         <w:rPr>
           <w:color w:val="000000"/>
         </w:rPr>
-        <w:t xml:space="preserve">Cứ hễ doanh nghiệp nào xuất khẩu được lô hàng cơ khí, hay báo chí đưa tin về một công trình trọng điểm vừa hoàn thành, thì chỉ vài phút sau, dưới phần bình luận chắc chắn sẽ xuất hiện vị giám khảo quen thuộc với câu hỏi muôn thuở: </w:t>
+        <w:t xml:space="preserve">Cứ hễ có tin doanh nghiệp nào đó xuất khẩu được lô hàng cơ khí, hay công trình nào đó vừa khánh thành, thì chỉ vài phút sau, phần bình luận đã có ngay vị giám khảo quen thuộc, tay gõ phím rất nhanh: </w:t>
       </w:r>
       <w:r>
         <w:rPr>
@@ -208,7 +208,7 @@
         <w:rPr>
           <w:color w:val="000000"/>
         </w:rPr>
-        <w:t xml:space="preserve">Tôi không bình luận về động cơ của câu hỏi đó. </w:t>
+        <w:t>Tôi không bình luận gì về động cơ của câu hỏi đó.</w:t>
       </w:r>
     </w:p>
     <w:p>
@@ -216,7 +216,7 @@
         <w:rPr>
           <w:color w:val="000000"/>
         </w:rPr>
-        <w:t xml:space="preserve">Chỉ là tôi thấy hơi tò mò về cách chúng ta chọn thước đo. </w:t>
+        <w:t>Chỉ là tôi hơi tò mò về cách chúng ta chọn thước đo thôi.</w:t>
       </w:r>
     </w:p>
     <w:p>
@@ -224,7 +224,7 @@
         <w:rPr>
           <w:color w:val="000000"/>
         </w:rPr>
-        <w:t xml:space="preserve">Năm 2023, tổng kim ngạch xuất khẩu sản phẩm cơ khí của Việt Nam đạt con số 52 tỷ đô la Mỹ. </w:t>
+        <w:t>Năm 2023, tổng kim ngạch xuất khẩu hàng cơ khí Việt Nam — 52 tỷ đô.</w:t>
       </w:r>
     </w:p>
     <w:p>
@@ -232,7 +232,7 @@
         <w:rPr>
           <w:color w:val="000000"/>
         </w:rPr>
-        <w:t xml:space="preserve">Năm mươi hai tỷ. Con số này lớn hơn toàn bộ quy mô nền kinh tế của không ít quốc gia trên bản đồ thế giới. </w:t>
+        <w:t>Năm mươi hai tỷ.</w:t>
       </w:r>
     </w:p>
     <w:p>
@@ -240,7 +240,7 @@
         <w:rPr>
           <w:color w:val="000000"/>
         </w:rPr>
-        <w:t xml:space="preserve">Và những sản phẩm ấy đi đâu? </w:t>
+        <w:t>Con số đó to hơn cả nền kinh tế của kha khá quốc gia trên bản đồ thế giới.</w:t>
       </w:r>
     </w:p>
     <w:p>
@@ -248,7 +248,7 @@
         <w:rPr>
           <w:color w:val="000000"/>
         </w:rPr>
-        <w:t xml:space="preserve">Tại Bình Dương, xưởng cơ khí của Công ty Duy Khanh gia công những chi tiết linh kiện với dung sai 0,01 milimét — mỏng hơn một phần năm sợi tóc — phục vụ cho hệ thống van áp lực của tàu ngầm hạt nhân Pháp. </w:t>
+        <w:t>Mà hàng gì? Đi đâu?</w:t>
       </w:r>
     </w:p>
     <w:p>
@@ -256,7 +256,7 @@
         <w:rPr>
           <w:color w:val="000000"/>
         </w:rPr>
-        <w:t xml:space="preserve">Tại Quảng Ngãi, những người thợ của Doosan Vina chế tạo các khối lò hơi khổng lồ nặng hàng nghìn tấn, chịu được áp suất hủy diệt và nhiệt độ nung chảy, để xuất khẩu sang Trung Đông và châu Âu. </w:t>
+        <w:t>Ở Bình Dương, xưởng cơ khí Duy Khanh — mấy trăm người, bụi sắt bay mù — gia công chi tiết cho hệ thống van áp lực tàu ngầm hạt nhân của Pháp. Dung sai cho phép: 0,01 milimét. Mỏng hơn một phần năm sợi tóc. Sai một chút — cả cái tàu ngầm mấy tỷ đô uống nước biển.</w:t>
       </w:r>
     </w:p>
     <w:p>
@@ -264,7 +264,7 @@
         <w:rPr>
           <w:color w:val="000000"/>
         </w:rPr>
-        <w:t>Thợ Việt Nam làm. Kỹ sư Việt Nam nghiệm thu. Đối tác quốc tế gật đầu nhận hàng.</w:t>
+        <w:t>Thợ Việt làm. Lặng lẽ.</w:t>
       </w:r>
     </w:p>
     <w:p>
@@ -272,7 +272,7 @@
         <w:rPr>
           <w:color w:val="000000"/>
         </w:rPr>
-        <w:t>Thế nhưng, trên không gian mạng của chúng ta, tấm bằng tốt nghiệp cơ khí của họ dường như vẫn bị đánh trượt. Đơn giản vì một bài kiểm tra mang tên... ốc vít.</w:t>
+        <w:t>Ở Quảng Ngãi, Doosan Vina chế tạo lò hơi nặng hàng nghìn tấn, chịu áp suất và nhiệt độ đủ sức nấu chảy mọi thứ. Xuất đi Trung Đông, đi châu Âu. Mấy ông Nhật, ông Hàn khó tính nhất hành tinh — chụp X-quang từng mối hàn, kiểm tra bằng siêu âm — vẫn gật đầu nhận hàng.</w:t>
       </w:r>
     </w:p>
     <w:p>
@@ -280,7 +280,15 @@
         <w:rPr>
           <w:color w:val="000000"/>
         </w:rPr>
-        <w:t>Một nền công nghiệp có thể làm được chân đế giàn khoan cắm sâu dưới đáy biển gầm thét, nhưng lại bị hoài nghi vì một rãnh ren kim loại trên bàn phím.</w:t>
+        <w:t>Thế nhưng, trên mạng xã hội nhà mình, tấm bằng tốt nghiệp cơ khí của mấy anh thợ ấy vẫn bị đánh trượt. Lý do: chưa qua được bài thi mang tên... ốc vít.</w:t>
+      </w:r>
+    </w:p>
+    <w:p>
+      <w:r>
+        <w:rPr>
+          <w:color w:val="000000"/>
+        </w:rPr>
+        <w:t>Một nền công nghiệp đủ sức đóng chân đế giàn khoan cắm xuống đáy biển sâu, mà lại bị chấm điểm bởi cái rãnh ren kim loại gõ trên bàn phím.</w:t>
       </w:r>
     </w:p>
     <w:p>
@@ -307,7 +315,7 @@
         <w:rPr>
           <w:color w:val="000000"/>
         </w:rPr>
-        <w:t>#### Vòng xoắn 2: Bẫy logic và bài toán dập nguội triệu đô</w:t>
+        <w:t>#### Vòng xoắn 2: Cái bẫy ngọt ngào mang tên "ốc vít"</w:t>
       </w:r>
     </w:p>
     <w:p>
@@ -315,7 +323,7 @@
         <w:rPr>
           <w:color w:val="000000"/>
         </w:rPr>
-        <w:t xml:space="preserve">Để công bằng mà nói, những người hay hỏi về con ốc vít không hẳn là không có lý. </w:t>
+        <w:t>Nói cho công bằng, những người hay hỏi về con ốc vít không hẳn là sai.</w:t>
       </w:r>
     </w:p>
     <w:p>
@@ -323,7 +331,7 @@
         <w:rPr>
           <w:color w:val="000000"/>
         </w:rPr>
-        <w:t>Chỉ có điều, họ đang tự dẫn mình vào một cái bẫy logic rất ngọt ngào.</w:t>
+        <w:t>Chỉ có điều, họ đang tự dẫn mình vào một cái bẫy rất ngọt.</w:t>
       </w:r>
     </w:p>
     <w:p>
@@ -331,7 +339,7 @@
         <w:rPr>
           <w:color w:val="000000"/>
         </w:rPr>
-        <w:t>Cái bẫy đó vận hành như thế này: Nếu không làm nổi một con ốc vít đơn giản, thì làm sao làm được những thứ to tát hơn? Vậy nên, chừng nào chưa thấy con ốc vít "Made in Vietnam" nằm trong chiếc điện thoại thông minh, thì mọi thành tựu khác đều chỉ là gia công hộ.</w:t>
+        <w:t>Cái bẫy nó chạy thế này: Nếu không làm nổi một con ốc vít đơn giản thì làm sao làm được thứ to hơn? Vậy nên, chừng nào chưa thấy ốc vít "Made in Vietnam" nằm trong chiếc iPhone, thì mọi thành tựu kia đều chỉ là gia công hộ.</w:t>
       </w:r>
     </w:p>
     <w:p>
@@ -339,7 +347,7 @@
         <w:rPr>
           <w:color w:val="000000"/>
         </w:rPr>
-        <w:t>Nghe rất xuôi tai. Rất chặt chẽ.</w:t>
+        <w:t>Nghe xuôi tai phết. Chặt chẽ nữa.</w:t>
       </w:r>
     </w:p>
     <w:p>
@@ -347,7 +355,7 @@
         <w:rPr>
           <w:color w:val="000000"/>
         </w:rPr>
-        <w:t>Chỉ có điều, người ta quên mất một sự thật trần trụi: ốc vít có dăm bảy loại ốc vít.</w:t>
+        <w:t>Chỉ có điều, mọi người quên mất một chuyện: ốc vít có dăm bảy loại.</w:t>
       </w:r>
     </w:p>
     <w:p>
@@ -355,7 +363,7 @@
         <w:rPr>
           <w:color w:val="000000"/>
         </w:rPr>
-        <w:t>Loại ốc vít thông thường dùng để đóng bàn ghế, treo tranh trên tường, hay ghép mí tôn — loại mà bạn ra chợ đầu mối mua cả cân với giá vài chục nghìn đồng — các xưởng cơ khí Việt Nam đã tự sản xuất từ cách đây vài thập kỷ. Sản xuất nhiều đến mức chẳng ai thèm nhập khẩu về làm gì cho chật kho.</w:t>
+        <w:t>Loại ốc vít đóng bàn ghế, bắt mí tôn — ra chợ Bình Tân mua cả cân giá rẻ hơn ly trà đá — xưởng Việt Nam sản xuất từ lâu lắm rồi. Nhiều đến mức chẳng ai thèm nhập về cho chật kho.</w:t>
       </w:r>
     </w:p>
     <w:p>
@@ -363,7 +371,7 @@
         <w:rPr>
           <w:color w:val="000000"/>
         </w:rPr>
-        <w:t xml:space="preserve">Còn loại ốc vít mà người ta thường đem ra thở dài ngao ngán, là ốc vít vi mô cường độ cao dùng cho smartphone, hoặc ốc hợp kim đặc chủng dùng cho khối động cơ ô tô. </w:t>
+        <w:t>Còn loại mà người ta hay đem ra thở dài, là ốc vít cường độ cao cho smartphone, cho khối động cơ ô tô. Loại này đòi thép đặc chủng, xử lý nhiệt chính xác, dung sai siêu nhỏ. Một con giá bằng cả bịch 500 con ốc chợ Bình Tân cộng lại.</w:t>
       </w:r>
     </w:p>
     <w:p>
@@ -371,7 +379,7 @@
         <w:rPr>
           <w:color w:val="000000"/>
         </w:rPr>
-        <w:t xml:space="preserve">Và ở đây, bài toán không nằm ở chỗ "tay nghề người Việt có tiện nổi hay không". </w:t>
+        <w:t>Vậy tại sao chưa làm hàng loạt?</w:t>
       </w:r>
     </w:p>
     <w:p>
@@ -379,7 +387,7 @@
         <w:rPr>
           <w:color w:val="000000"/>
         </w:rPr>
-        <w:t>Bài toán nằm ở chiếc máy tính của người làm kinh doanh.</w:t>
+        <w:t>Không phải vì thợ mình không tiện nổi đâu. Mà vì cái máy tính bỏ túi của người làm kinh doanh nó không cho phép.</w:t>
       </w:r>
     </w:p>
     <w:p>
@@ -387,7 +395,7 @@
         <w:rPr>
           <w:color w:val="000000"/>
         </w:rPr>
-        <w:t xml:space="preserve">Muốn sản xuất hàng loạt loại ốc vít siêu chính xác đó đạt tiêu chuẩn toàn cầu, bạn cần đầu tư một dây chuyền dập nguội tự động, hệ thống nhiệt luyện chân không và dàn máy quang phổ kiểm định. Một cụm thiết bị tử tế như vậy có giá dao động từ 5 đến 10 triệu đô la Mỹ. </w:t>
+        <w:t>Tôi tính cho bạn nghe nhé.</w:t>
       </w:r>
     </w:p>
     <w:p>
@@ -395,7 +403,7 @@
         <w:rPr>
           <w:color w:val="000000"/>
         </w:rPr>
-        <w:t xml:space="preserve">Bỏ ra khoảng 150 đến 250 tỷ đồng, nhà máy của bạn sẽ dập ra hàng triệu con ốc mỗi ngày. </w:t>
+        <w:t>Muốn dập ốc vít siêu chính xác đạt chuẩn quốc tế, cần một dây chuyền dập nguội tự động, lò nhiệt luyện chân không, máy quang phổ kiểm định — gom lại tầm 5 đến 10 triệu đô. Quy ra tiền Việt là cỡ 150 đến 250 tỷ.</w:t>
       </w:r>
     </w:p>
     <w:p>
@@ -403,7 +411,7 @@
         <w:rPr>
           <w:color w:val="000000"/>
         </w:rPr>
-        <w:t>Và câu hỏi xuất hiện: Bạn bán cho ai?</w:t>
+        <w:t>Bỏ ra 200 tỷ, nhà máy chạy rần rần, mỗi ngày dập ra hàng triệu con ốc sáng bóng.</w:t>
       </w:r>
     </w:p>
     <w:p>
@@ -411,7 +419,7 @@
         <w:rPr>
           <w:color w:val="000000"/>
         </w:rPr>
-        <w:t xml:space="preserve">Các tập đoàn đa quốc gia khi đặt nhà máy lắp ráp tại Việt Nam, chuỗi cung ứng của họ đã được đóng gói nguyên khối từ công ty mẹ ở Nhật Bản hay Hàn Quốc. Họ mang theo hợp đồng toàn cầu với những nhà cung ứng đã đi cùng họ suốt 30 năm. </w:t>
+        <w:t>Rồi bán cho ai?</w:t>
       </w:r>
     </w:p>
     <w:p>
@@ -419,14 +427,14 @@
         <w:rPr>
           <w:color w:val="000000"/>
         </w:rPr>
-        <w:t xml:space="preserve">Khi một doanh nghiệp cơ khí Việt Nam mang con ốc vít tự làm đến chào hàng với giá rẻ hơn 10%, câu trả lời thường nhận được là một nụ cười rất lịch thiệp: </w:t>
+        <w:t xml:space="preserve">Mấy ông Samsung, Toyota, Honda đặt nhà máy ở Việt Nam — họ mang theo nguyên bộ nhà cung ứng đã đi cùng suốt 30 năm từ Nhật, từ Hàn. Hợp đồng toàn cầu, danh mục kín bưng. Anh cơ khí Việt cầm con ốc tự làm đến chào hàng, giá rẻ hơn 10%, người ta cười rất lịch sự rồi bảo: </w:t>
       </w:r>
       <w:r>
         <w:rPr>
           <w:i/>
           <w:color w:val="000000"/>
         </w:rPr>
-        <w:t>"Sản phẩm của anh rất tốt, nhưng quy chuẩn toàn cầu của chúng tôi không cho phép mua linh kiện rời ngoài danh mục đã kiểm duyệt."</w:t>
+        <w:t>"Cảm ơn anh, nhưng danh mục nhà cung ứng toàn cầu của chúng tôi đã đóng rồi. Không mua lẻ ngoài danh sách được."</w:t>
       </w:r>
     </w:p>
     <w:p>
@@ -434,7 +442,7 @@
         <w:rPr>
           <w:color w:val="000000"/>
         </w:rPr>
-        <w:t xml:space="preserve">Đầu tư 200 tỷ đồng để rồi mỗi ngày dập ra hàng triệu con ốc bỏ vào kho ngắm, chỉ để chứng minh cho cư dân mạng thấy là "tôi làm được" — đó không phải là phát triển công nghiệp. </w:t>
+        <w:t>Bỏ 200 tỷ dập ốc rồi chất đống trong kho ngắm, chỉ để vài anh trên mạng gật gù bảo "ờ, vậy mới gọi là làm được" — đó không phải phát triển công nghiệp.</w:t>
       </w:r>
     </w:p>
     <w:p>
@@ -442,7 +450,7 @@
         <w:rPr>
           <w:color w:val="000000"/>
         </w:rPr>
-        <w:t>Đó là hành vi giải trí vô cùng tốn kém.</w:t>
+        <w:t>Đó là trò giải trí tốn kém nhất mà tôi từng nghe.</w:t>
       </w:r>
     </w:p>
     <w:p>
@@ -450,7 +458,15 @@
         <w:rPr>
           <w:color w:val="000000"/>
         </w:rPr>
-        <w:t>Người ta hay bảo: phe bảo vệ cho rằng không cần làm ốc vít, phe chỉ trích bảo không làm được là kém cỏi. Cả hai phe đều có lý lẽ riêng. Nhưng có lẽ cả hai đều đang miệt mài tìm lời giải cho một đề thi... mà người ra đề vốn dĩ không có ý định chấm điểm.</w:t>
+        <w:t>Mà hay ở chỗ này: Phe này bảo không cần làm ốc vít. Phe kia bảo không làm được là dở. Hai phe cãi nhau ầm ĩ.</w:t>
+      </w:r>
+    </w:p>
+    <w:p>
+      <w:r>
+        <w:rPr>
+          <w:color w:val="000000"/>
+        </w:rPr>
+        <w:t>Nhưng tôi để ý — có vẻ cả hai phe đều đang hì hục giải một đề thi mà người ra đề... không hề có ý chấm điểm.</w:t>
       </w:r>
     </w:p>
     <w:p>
@@ -469,7 +485,7 @@
         <w:rPr>
           <w:color w:val="000000"/>
         </w:rPr>
-        <w:t>#### Vòng xoắn 3: Gương soi hai mặt và những người hùng áo xanh</w:t>
+        <w:t>#### Vòng xoắn 3: Ai đang cúi, ai đang ngẩng?</w:t>
       </w:r>
     </w:p>
     <w:p>
@@ -477,14 +493,14 @@
         <w:rPr>
           <w:color w:val="000000"/>
         </w:rPr>
-        <w:t xml:space="preserve">Nó giống như việc bạn bước vào một nhà hàng sang trọng, thấy người đầu bếp vừa hoàn thành món bò Wellington thượng hạng đòi hỏi kỹ thuật đỉnh cao, rồi bạn bước tới vỗ vai anh ta và hỏi: </w:t>
+        <w:t xml:space="preserve">Chuyện này nó giống kiểu bạn bước vào quán ăn, thấy anh đầu bếp vừa xong món bò Wellington đỉnh cao, bạn vỗ vai hỏi: </w:t>
       </w:r>
       <w:r>
         <w:rPr>
           <w:i/>
           <w:color w:val="000000"/>
         </w:rPr>
-        <w:t>"Sao không thấy anh tự trồng lúa mì để làm vỏ bánh?"</w:t>
+        <w:t>"Sao anh không tự trồng lúa mì làm vỏ bánh?"</w:t>
       </w:r>
     </w:p>
     <w:p>
@@ -492,14 +508,14 @@
         <w:rPr>
           <w:color w:val="000000"/>
         </w:rPr>
-        <w:t xml:space="preserve">Nếu anh đầu bếp trả lời rằng bột mì đi mua từ trang trại chuyên canh thì tiện hơn, bạn liền lắc đầu kết luận: </w:t>
+        <w:t xml:space="preserve">Anh ấy bảo bột mì mua từ trang trại chuyên canh thì tiện hơn, bạn lắc đầu: </w:t>
       </w:r>
       <w:r>
         <w:rPr>
           <w:i/>
           <w:color w:val="000000"/>
         </w:rPr>
-        <w:t>"Anh nấu ăn dở tệ."</w:t>
+        <w:t>"Vậy thì anh nấu dở."</w:t>
       </w:r>
     </w:p>
     <w:p>
@@ -507,7 +523,7 @@
         <w:rPr>
           <w:color w:val="000000"/>
         </w:rPr>
-        <w:t xml:space="preserve">Chuỗi cung ứng toàn cầu không bao giờ vận hành theo tinh thần "tự cung tự cấp" thời phong kiến. Hàn Quốc làm ra những con tàu chở hàng khổng lồ và màn hình OLED số một thế giới, nhưng họ vẫn phải nhập hóa chất tinh khiết từ Nhật Bản. Nhật Bản dẫn đầu về cơ khí chính xác, nhưng nguồn đất hiếm vẫn phải trông cậy vào đối tác khác. </w:t>
+        <w:t>Tức cười thật. Nhưng chúng ta đang làm đúng y vậy.</w:t>
       </w:r>
     </w:p>
     <w:p>
@@ -515,7 +531,7 @@
         <w:rPr>
           <w:color w:val="000000"/>
         </w:rPr>
-        <w:t>Không một quốc gia nào đủ rảnh rỗi và đủ nguồn lực để làm tất cả mọi thứ — từ hạt cát cho đến con tàu vũ trụ.</w:t>
+        <w:t>Hàn Quốc — đóng tàu chở hàng khổng lồ, màn hình OLED số một thế giới — vẫn phải nhập hóa chất tinh khiết từ Nhật. Nhật — cơ khí chính xác hàng đầu — vẫn phải mua đất hiếm từ chỗ khác. Không ai tự nấu hết mọi thứ từ A đến Z cả. Thế giới nó phân công nhau, mỗi anh làm cái mình giỏi nhất, rồi mua bán qua lại. Đơn giản vậy thôi.</w:t>
       </w:r>
     </w:p>
     <w:p>
@@ -523,7 +539,14 @@
         <w:rPr>
           <w:color w:val="000000"/>
         </w:rPr>
-        <w:t>Thế nhưng, trong khi thế giới phân vai sòng phẳng để kiếm tiền, thì một bộ phận trong chúng ta lại rất thích phân vai để... tự làm khổ nhau.</w:t>
+        <w:t xml:space="preserve">Nhưng mà không ai hỏi Hàn Quốc: </w:t>
+      </w:r>
+      <w:r>
+        <w:rPr>
+          <w:i/>
+          <w:color w:val="000000"/>
+        </w:rPr>
+        <w:t>"Ơ, mấy cái hóa chất chưa tự nấu được thì nói gì?"</w:t>
       </w:r>
     </w:p>
     <w:p>
@@ -531,7 +554,7 @@
         <w:rPr>
           <w:color w:val="000000"/>
         </w:rPr>
-        <w:t>Có một sự tương phản mà mỗi lần nghĩ đến, tôi lại thấy một khoảng lặng khó tả.</w:t>
+        <w:t>Vì sao? Vì người ta nhìn vào cái Hàn Quốc LÀM ĐƯỢC — tàu hàng, ô tô, tivi, điện thoại — chứ không cầm cái chưa làm được ra phủ nhận tất cả.</w:t>
       </w:r>
     </w:p>
     <w:p>
@@ -539,7 +562,7 @@
         <w:rPr>
           <w:color w:val="000000"/>
         </w:rPr>
-        <w:t>Ở ngoài kia, những người thợ cơ khí Việt Nam — với bộ quần áo bảo hộ sờn vai, đôi bàn tay chai sạn cáu bẩn dầu mỡ, đôi mắt nheo lại sau tấm kính hàn dưới cái nóng hầm hập của xưởng tôn — họ vẫn đang cắm cúi tiện từng chi tiết máy, căn chỉnh từng vạch micromet. Họ làm việc trong tiếng ồn đinh tai nhức óc của máy dập, nhận mức lương tháng mười mấy triệu đồng, tan ca về ăn vội bát cơm rồi chợp mắt trong căn phòng trọ chật hẹp.</w:t>
+        <w:t>Còn mình thì ngược lại. Cầm con ốc vít — phủ nhận luôn cả cái sân vận động.</w:t>
       </w:r>
     </w:p>
     <w:p>
@@ -547,7 +570,7 @@
         <w:rPr>
           <w:color w:val="000000"/>
         </w:rPr>
-        <w:t>Họ không có thời gian để lên mạng đôi co xem con ốc vít quan trọng hay mái vòm World Cup quan trọng.</w:t>
+        <w:t>Cũng thú vị.</w:t>
       </w:r>
     </w:p>
     <w:p>
@@ -555,7 +578,39 @@
         <w:rPr>
           <w:color w:val="000000"/>
         </w:rPr>
-        <w:t xml:space="preserve">Còn trên màn hình phẳng của những chiếc điện thoại đắt tiền, một vài cá nhân chỉ cần buông một dòng trạng thái bông lơn: </w:t>
+        <w:t>Thế nhưng, cái khiến tôi nghĩ nhiều nhất không phải chuyện ốc vít.</w:t>
+      </w:r>
+    </w:p>
+    <w:p>
+      <w:r>
+        <w:rPr>
+          <w:color w:val="000000"/>
+        </w:rPr>
+        <w:t>Mà là sự tương phản.</w:t>
+      </w:r>
+    </w:p>
+    <w:p>
+      <w:r>
+        <w:rPr>
+          <w:color w:val="000000"/>
+        </w:rPr>
+        <w:t>Ở ngoài kia, mấy anh thợ cơ khí — quần áo bảo hộ sờn vai, tay chai sạn cáu dầu mỡ, mắt nheo lại sau kính hàn giữa cái nóng hầm hập của xưởng tôn — vẫn đang cắm cúi tiện từng chi tiết, căn từng vạch micromet. Tiếng máy dập đinh tai. Lương tháng mười mấy triệu. Tan ca ăn vội bát cơm, về phòng trọ chợp mắt.</w:t>
+      </w:r>
+    </w:p>
+    <w:p>
+      <w:r>
+        <w:rPr>
+          <w:color w:val="000000"/>
+        </w:rPr>
+        <w:t>Họ không có thời gian lên mạng tranh cãi xem ốc vít quan trọng hơn hay mái vòm World Cup quan trọng hơn.</w:t>
+      </w:r>
+    </w:p>
+    <w:p>
+      <w:r>
+        <w:rPr>
+          <w:color w:val="000000"/>
+        </w:rPr>
+        <w:t xml:space="preserve">Còn trên màn hình điện thoại, vài anh chị chỉ cần buông một câu: </w:t>
       </w:r>
       <w:r>
         <w:rPr>
@@ -568,7 +623,7 @@
         <w:rPr>
           <w:color w:val="000000"/>
         </w:rPr>
-        <w:t xml:space="preserve"> — thế là thu về hàng nghìn lượt tương tác, hàng trăm lượt chia sẻ đồng cảm.</w:t>
+        <w:t xml:space="preserve"> — thế là nghìn lượt thích, trăm lượt chia sẻ.</w:t>
       </w:r>
     </w:p>
     <w:p>
@@ -576,7 +631,7 @@
         <w:rPr>
           <w:color w:val="000000"/>
         </w:rPr>
-        <w:t xml:space="preserve">Người làm ra giá trị thật cho đất nước thì lặng lẽ như bóng đêm. </w:t>
+        <w:t>Người tạo ra giá trị thật thì im lìm.</w:t>
       </w:r>
     </w:p>
     <w:p>
@@ -584,7 +639,7 @@
         <w:rPr>
           <w:color w:val="000000"/>
         </w:rPr>
-        <w:t>Người chỉ trích giá trị thì rực rỡ dưới ánh đèn bàn phím.</w:t>
+        <w:t>Người chê giá trị thì rực rỡ.</w:t>
       </w:r>
     </w:p>
     <w:p>
@@ -592,7 +647,7 @@
         <w:rPr>
           <w:color w:val="000000"/>
         </w:rPr>
-        <w:t>Tôi không biết nên gọi đó là sự bất công, hay đơn giản chỉ là một quy luật kỳ quặc của thời đại số.</w:t>
+        <w:t>Tôi không rõ nên gọi đó là bất công, hay chỉ là một thói quen kỳ lạ của thời đại lướt ngón tay.</w:t>
       </w:r>
     </w:p>
     <w:p>
@@ -611,7 +666,7 @@
         <w:rPr>
           <w:color w:val="000000"/>
         </w:rPr>
-        <w:t>### LỜI KẾT: CÂU KẾT TREO ÁM ẢNH</w:t>
+        <w:t>### LỜI KẾT: CÂU KẾT TREO</w:t>
       </w:r>
     </w:p>
     <w:p>
@@ -619,7 +674,7 @@
         <w:rPr>
           <w:color w:val="000000"/>
         </w:rPr>
-        <w:t xml:space="preserve">Nhưng dù ai có nói gì đi nữa, thì mái vòm thép Lusail giữa sa mạc vẫn đang sừng sững đứng đó. </w:t>
+        <w:t>Nhưng dù ai nói gì thì nói, mái vòm thép Lusail giữa sa mạc vẫn đang đứng đó. Lò hơi nghìn tấn vẫn đang vận hành bên kia bán cầu. Và những khối thép mang bàn tay thợ Việt vẫn đang cắm sâu dưới thềm biển Bắc, chống từng cơn sóng.</w:t>
       </w:r>
     </w:p>
     <w:p>
@@ -627,7 +682,7 @@
         <w:rPr>
           <w:color w:val="000000"/>
         </w:rPr>
-        <w:t xml:space="preserve">Những lò hơi công nghiệp chịu nhiệt vẫn đang vận hành trong các nhà máy điện bên kia bán cầu. </w:t>
+        <w:t>Có lẽ đã đến lúc cất cái thước kẻ "ốc vít" đã sờn cũ suốt mười năm ấy vào ngăn kéo.</w:t>
       </w:r>
     </w:p>
     <w:p>
@@ -635,23 +690,7 @@
         <w:rPr>
           <w:color w:val="000000"/>
         </w:rPr>
-        <w:t>Và những khối kết cấu thép ngàn tấn mang bàn tay thợ Việt vẫn đang âm thầm cắm sâu xuống thềm lục địa biển Bắc, chống chọi với từng cơn sóng dữ.</w:t>
-      </w:r>
-    </w:p>
-    <w:p>
-      <w:r>
-        <w:rPr>
-          <w:color w:val="000000"/>
-        </w:rPr>
-        <w:t xml:space="preserve">Có lẽ đã đến lúc chúng ta nên cất chiếc thước kẻ mang tên "con ốc vít" đã sờn cũ suốt mười năm qua vào ngăn kéo kỷ niệm. </w:t>
-      </w:r>
-    </w:p>
-    <w:p>
-      <w:r>
-        <w:rPr>
-          <w:color w:val="000000"/>
-        </w:rPr>
-        <w:t>Bởi vì một dân tộc đã bắt đầu học cách dựng nên những công trình vươn tới tận trời mây, thì thật kỳ lạ nếu cứ mãi bắt nhau cúi đầu xuống đất... chỉ để nhặt một chiếc đinh rơi.</w:t>
+        <w:t>Bởi vì dân mình đã bắt đầu dựng được những thứ chạm tới mây rồi, thì thật lạ nếu cứ bắt nhau cúi mặt xuống đất... chỉ để nhặt một chiếc đinh rơi.</w:t>
       </w:r>
     </w:p>
     <w:p>
@@ -678,7 +717,7 @@
         <w:rPr>
           <w:color w:val="000000"/>
         </w:rPr>
-        <w:t>Ý kiến của bạn về vấn đề này thế nào? Bạn nghĩ chúng ta nên tiếp tục tự dằn vặt mình bằng bài kiểm tra ốc vít, hay đã đến lúc nhìn nhận nền cơ khí Việt Nam qua những công trình tầm vóc thực sự? Hãy để lại suy nghĩ của bạn ở phần bình luận nhé!</w:t>
+        <w:t>Bạn nghĩ sao? Con ốc vít có xứng đáng làm thước đo cho cả nền công nghiệp không? Hay chúng ta đang tự hạ mình xuống mà không biết? Để lại bình luận cho tôi nhé!</w:t>
       </w:r>
     </w:p>
     <w:p>

</xml_diff>